<commit_message>
feat: Nang cap toan dien he thong tien kiem da luong, tich hop SAPC Chrome, BTools, CEM, CCOS va hoan thien README.md
</commit_message>
<xml_diff>
--- a/docs/VNPT PRECHECK.docx
+++ b/docs/VNPT PRECHECK.docx
@@ -943,7 +943,7 @@
           <w:sz w:val="26"/>
           <w:rFonts w:ascii="Times New Roman" w:hAnsi="Times New Roman" w:cs="Times New Roman" w:eastAsia="Times New Roman"/>
         </w:rPr>
-        <w:t>“Xây dựng phần mềm VNPT PRECHECK tự động hóa toàn trình quy trình phân tích, chẩn đoán và đóng phiếu phản ánh khách hàng Mobile Internet, kết hợp nền tảng tiền kiểm tra tập trung đa dịch vụ trên mạng di động VNPT”</w:t>
+        <w:t>“Xây dựng phần mềm VNPT TTS PRECHECK tự động hóa toàn trình quy trình phân tích, chẩn đoán và đóng phiếu phản ánh khách hàng Mobile Internet, kết hợp nền tảng tiền kiểm tra tập trung đa dịch vụ trên mạng di động VNPT”</w:t>
       </w:r>
     </w:p>
     <w:p>
@@ -1606,7 +1606,7 @@
           <w:sz w:val="26"/>
           <w:rFonts w:ascii="Times New Roman" w:hAnsi="Times New Roman" w:cs="Times New Roman" w:eastAsia="Times New Roman"/>
         </w:rPr>
-        <w:t>Phần mềm VNPT PRECHECK được thiết kế bài bản theo mô hình hiện đại, phân định rõ ràng giữa phân hệ Tự động hóa toàn trình Mobile Internet và phân hệ Tiền kiểm tra hỗ trợ các loại phản ánh khác:</w:t>
+        <w:t>Phần mềm VNPT TTS PRECHECK được thiết kế bài bản theo mô hình hiện đại, phân định rõ ràng giữa phân hệ Tự động hóa toàn trình Mobile Internet và phân hệ Tiền kiểm tra hỗ trợ các loại phản ánh khác:</w:t>
       </w:r>
     </w:p>
     <w:p>
@@ -1623,7 +1623,7 @@
           <w:sz w:val="26"/>
           <w:rFonts w:ascii="Times New Roman" w:hAnsi="Times New Roman" w:cs="Times New Roman" w:eastAsia="Times New Roman"/>
         </w:rPr>
-        <w:t>1. Kiến trúc tổng thể và tích hợp REST API đa hệ thống (TTS Cũ &amp; Mới):</w:t>
+        <w:t>1. Kiến trúc tổng thể và tích hợp REST API đa hệ thống (TTS Cũ, TTS Mới, CCOS, PMS, FMS):</w:t>
       </w:r>
     </w:p>
     <w:p>
@@ -1657,7 +1657,7 @@
           <w:sz w:val="26"/>
           <w:rFonts w:ascii="Times New Roman" w:hAnsi="Times New Roman" w:cs="Times New Roman" w:eastAsia="Times New Roman"/>
         </w:rPr>
-        <w:t>• Tầng Giao diện người dùng (Presentation Layer): Web Dashboard trực quan, hiển thị Live Log thời gian thực, tách biệt rành mạch giữa nhóm Mobile Internet (Data) và Thoại/SMS/Gói/PA Khác (Voice), bộ lọc đa tiêu chí, hỗ trợ chế độ Dark Mode / Light Mode;</w:t>
+        <w:t>• Tầng Giao diện người dùng (Presentation Layer): Web Dashboard trực quan, thiết kế khoa học theo tỷ lệ vàng 3/3/4 (Khối 1: Thông tin phiếu; Khối 2: Thông số kỹ thuật Core HSS &amp; Trạm sóng CEM; Khối 3: Phân tích phiên dữ liệu BTools &amp; Đề xuất kịch bản chẩn đoán), hiển thị Live Log thời gian thực qua WebSocket, tách biệt rành mạch giữa nhóm Mobile Internet (Data) và Thoại/SMS/Gói/PA Khác (Voice), bộ lọc đa tiêu chí; tích hợp chuyển đổi Chế độ Ban ngày &amp; Ban đêm (Light Mode / Dark Mode) chuẩn màu Deep Navy kết hợp Soft Neon công nghệ cao chống mỏi mắt cho KTV trực ca đêm 24/7; chuẩn hóa hệ thống nút thao tác đa sắc phân cấp luồng xử lý (Chuyển 2.4 màu tím Indigo, Chuyển 2.6 màu xanh Cyan viễn thông, Đóng 2.6 màu xanh lá hoàn tất);</w:t>
       </w:r>
     </w:p>
     <w:p>
@@ -1674,7 +1674,7 @@
           <w:sz w:val="26"/>
           <w:rFonts w:ascii="Times New Roman" w:hAnsi="Times New Roman" w:cs="Times New Roman" w:eastAsia="Times New Roman"/>
         </w:rPr>
-        <w:t>• Tầng Dịch vụ &amp; Điều phối luồng (Service &amp; Orchestration Layer): Sử dụng máy chủ đa luồng ThreadingHTTPServer trên nền Python kết hợp mô hình Singleton AutomationState quản lý an toàn đa luồng. Luồng worker chạy ngầm định kỳ kích hoạt chu kỳ quét tự động và hỗ trợ can thiệp tức thời (Run Now / Stop);</w:t>
+        <w:t>• Tầng Dịch vụ &amp; Điều phối luồng (Service &amp; Orchestration Layer): Sử dụng máy chủ đa luồng FastAPI / Uvicorn trên nền Python kết hợp mô hình Singleton AutomationState quản lý an toàn đa luồng. Luồng worker chạy ngầm định kỳ kích hoạt chu kỳ quét tự động và hỗ trợ can thiệp tức thời (Run Now / Stop);</w:t>
       </w:r>
     </w:p>
     <w:p>
@@ -1708,7 +1708,7 @@
           <w:sz w:val="26"/>
           <w:rFonts w:ascii="Times New Roman" w:hAnsi="Times New Roman" w:cs="Times New Roman" w:eastAsia="Times New Roman"/>
         </w:rPr>
-        <w:t xml:space="preserve">  - Giao tiếp trực tiếp với hệ thống TTS Mới (tts.vnptnet.vn) và TTS Cũ (tts.vnpt.vn) thông qua giao thức REST API chuẩn;</w:t>
+        <w:t xml:space="preserve">  - Giao tiếp trực tiếp 100% qua REST API với cả hệ thống TTS Mới (tts.vnptnet.vn) và TTS Cũ (tts.vnpt.vn), loại bỏ hoàn toàn sự phụ thuộc vào giao diện web hay công nghệ cào màn hình (scraping) chậm chạp;</w:t>
       </w:r>
     </w:p>
     <w:p>
@@ -1725,7 +1725,24 @@
           <w:sz w:val="26"/>
           <w:rFonts w:ascii="Times New Roman" w:hAnsi="Times New Roman" w:cs="Times New Roman" w:eastAsia="Times New Roman"/>
         </w:rPr>
-        <w:t xml:space="preserve">  - Tích hợp module sapccheck tra cứu Trang Hồ sơ thuê bao (công nghệ Radio, IP WAN, cờ NAM, HSS Profile) và đối soát chính sách gói cước, quota dung lượng từ hệ thống SAPC;</w:t>
+        <w:t xml:space="preserve">  - Tích hợp cổng liên thông chuyển khiếu nại CCOS (/APICOSS/ChuyenKhieuNai), cổng phản hồi PMS (/APIPMS/PhanHoiPMS), FMS (/APIFMS/PhanHoiFMS), tự động nhận diện và tuân thủ chuẩn xác phân quyền OneOSS giữa Đơn vị chủ trì (ĐHDV) và Đơn vị phối hợp hỗ trợ nâng cao (SOC2);</w:t>
+      </w:r>
+    </w:p>
+    <w:p>
+      <w:pPr>
+        <w:spacing w:before="0" w:after="60" w:line="288" w:lineRule="auto"/>
+        <w:ind w:left="504" w:hanging="288"/>
+        <w:jc w:val="both"/>
+      </w:pPr>
+      <w:r>
+        <w:rPr>
+          <w:rFonts w:ascii="Times New Roman" w:hAnsi="Times New Roman"/>
+          <w:b w:val="0"/>
+          <w:i w:val="0"/>
+          <w:sz w:val="26"/>
+          <w:rFonts w:ascii="Times New Roman" w:hAnsi="Times New Roman" w:cs="Times New Roman" w:eastAsia="Times New Roman"/>
+        </w:rPr>
+        <w:t xml:space="preserve">  - Tích hợp module sapccheck tra cứu Trang Hồ sơ thuê bao (công nghệ Radio, IP WAN, cờ NAM, HSS Profile, cờ MS PURGED) và đối soát chính sách gói cước, quota dung lượng từ hệ thống SAPC;</w:t>
       </w:r>
     </w:p>
     <w:p>
@@ -1759,7 +1776,7 @@
           <w:sz w:val="26"/>
           <w:rFonts w:ascii="Times New Roman" w:hAnsi="Times New Roman" w:cs="Times New Roman" w:eastAsia="Times New Roman"/>
         </w:rPr>
-        <w:t xml:space="preserve">  - Tích hợp module crawler_btools.py truy xuất lịch sử phiên dữ liệu, throughput và QoS.</w:t>
+        <w:t xml:space="preserve">  - Tích hợp module crawler_btools.py / BTools Manager truy xuất lịch sử phiên dữ liệu, throughput và QoS.</w:t>
       </w:r>
     </w:p>
     <w:p>
@@ -1793,7 +1810,7 @@
           <w:sz w:val="26"/>
           <w:rFonts w:ascii="Times New Roman" w:hAnsi="Times New Roman" w:cs="Times New Roman" w:eastAsia="Times New Roman"/>
         </w:rPr>
-        <w:t>Để trực quan hóa toàn diện chu trình tự động hóa và sự phối hợp nhịp nhàng giữa các phân hệ kỹ thuật, sơ đồ luồng quy trình vận hành tổng thể của hệ thống VNPT PRECHECK được thể hiện chi tiết tại Hình 1 dưới đây:</w:t>
+        <w:t>Để trực quan hóa toàn diện chu trình tự động hóa và sự phối hợp nhịp nhàng giữa các phân hệ kỹ thuật, sơ đồ luồng quy trình vận hành tổng thể của hệ thống VNPT TTS PRECHECK được thể hiện chi tiết tại Hình 1 dưới đây:</w:t>
       </w:r>
     </w:p>
     <w:p>
@@ -1851,65 +1868,7 @@
           <w:sz w:val="22"/>
           <w:rFonts w:ascii="Times New Roman" w:hAnsi="Times New Roman" w:cs="Times New Roman" w:eastAsia="Times New Roman"/>
         </w:rPr>
-        <w:t>Hình 1: Sơ đồ luồng quy trình tự động hóa tiền kiểm tra hạ tầng, phân loại kịch bản và xử lý đóng phiếu của hệ thống VNPT PRECHECK</w:t>
-      </w:r>
-    </w:p>
-    <w:p>
-      <w:pPr>
-        <w:spacing w:before="120" w:after="40" w:line="240" w:lineRule="auto"/>
-        <w:ind w:firstLine="0"/>
-        <w:jc w:val="center"/>
-      </w:pPr>
-      <w:r>
-        <w:drawing>
-          <wp:inline xmlns:a="http://schemas.openxmlformats.org/drawingml/2006/main" xmlns:pic="http://schemas.openxmlformats.org/drawingml/2006/picture">
-            <wp:extent cx="5486400" cy="2603182"/>
-            <wp:docPr id="2" name="Picture 2"/>
-            <wp:cNvGraphicFramePr>
-              <a:graphicFrameLocks noChangeAspect="1"/>
-            </wp:cNvGraphicFramePr>
-            <a:graphic>
-              <a:graphicData uri="http://schemas.openxmlformats.org/drawingml/2006/picture">
-                <pic:pic>
-                  <pic:nvPicPr>
-                    <pic:cNvPr id="0" name="screenshot_production_ready.png"/>
-                    <pic:cNvPicPr/>
-                  </pic:nvPicPr>
-                  <pic:blipFill>
-                    <a:blip r:embed="rId11"/>
-                    <a:stretch>
-                      <a:fillRect/>
-                    </a:stretch>
-                  </pic:blipFill>
-                  <pic:spPr>
-                    <a:xfrm>
-                      <a:off x="0" y="0"/>
-                      <a:ext cx="5486400" cy="2603182"/>
-                    </a:xfrm>
-                    <a:prstGeom prst="rect"/>
-                  </pic:spPr>
-                </pic:pic>
-              </a:graphicData>
-            </a:graphic>
-          </wp:inline>
-        </w:drawing>
-      </w:r>
-    </w:p>
-    <w:p>
-      <w:pPr>
-        <w:spacing w:before="40" w:after="160" w:line="264" w:lineRule="auto"/>
-        <w:ind w:firstLine="0"/>
-        <w:jc w:val="center"/>
-      </w:pPr>
-      <w:r>
-        <w:rPr>
-          <w:rFonts w:ascii="Times New Roman" w:hAnsi="Times New Roman"/>
-          <w:b w:val="0"/>
-          <w:i/>
-          <w:sz w:val="22"/>
-          <w:rFonts w:ascii="Times New Roman" w:hAnsi="Times New Roman" w:cs="Times New Roman" w:eastAsia="Times New Roman"/>
-        </w:rPr>
-        <w:t>Hình 2: Giao diện Web Dashboard điều hành trung tâm VNPT PRECHECK với bảng điều khiển, bộ lọc đa tiêu chí và Live Log thời gian thực</w:t>
+        <w:t>Hình 1: Sơ đồ luồng quy trình tự động hóa tiền kiểm tra hạ tầng, phân loại kịch bản và xử lý đóng phiếu của hệ thống VNPT TTS PRECHECK</w:t>
       </w:r>
     </w:p>
     <w:p>
@@ -1994,7 +1953,7 @@
           <w:sz w:val="26"/>
           <w:rFonts w:ascii="Times New Roman" w:hAnsi="Times New Roman" w:cs="Times New Roman" w:eastAsia="Times New Roman"/>
         </w:rPr>
-        <w:t>• Trang Hồ sơ thuê bao &amp; SAPC: Trích xuất công nghệ mạng Radio thực tế (4G/3G/2G), trạng thái dịch vụ (cờ NAM = 0 là mở, NAM = 1 là khóa GPRS), mã HSS Profile (xác thực quyền truy cập 4G/5G), địa chỉ IP WAN cấp phát, gói cước data đang sử dụng, hạn dùng, dung lượng tốc độ cao còn lại, trạng thái bóp băng thông;</w:t>
+        <w:t>• Trang Hồ sơ thuê bao &amp; SAPC: Trích xuất công nghệ mạng Radio thực tế (4G/3G/2G), trạng thái dịch vụ (cờ NAM = 0 là mở, NAM = 1 là khóa GPRS), cờ trạng thái thuê bao Core (phát hiện thuê bao tắt máy dài ngày MS PURGED), mã HSS Profile (xác thực quyền truy cập 4G/5G), địa chỉ IP WAN cấp phát, gói cước data đang sử dụng, hạn dùng, dung lượng tốc độ cao còn lại, trạng thái bóp băng thông;</w:t>
       </w:r>
     </w:p>
     <w:p>
@@ -2096,7 +2055,7 @@
           <w:sz w:val="26"/>
           <w:rFonts w:ascii="Times New Roman" w:hAnsi="Times New Roman" w:cs="Times New Roman" w:eastAsia="Times New Roman"/>
         </w:rPr>
-        <w:t xml:space="preserve">  (1) Khóa chặn GPRS (NAM = 1); (2) Chưa khai báo Profile 4G trên HSS (HSS Profile = 0); (3) Phản ánh dịch vụ 5G nhưng Profile/Trạm chưa hỗ trợ 5G; (4) Thuê bao tắt máy dài ngày (MS PURGED).</w:t>
+        <w:t xml:space="preserve">  (1) Khóa chặn GPRS (NAM = 1); (2) Chưa khai báo Profile 4G trên HSS (HSS Profile = 0); (3) Phản ánh dịch vụ 5G nhưng Profile/Trạm chưa hỗ trợ 5G; (4) Thuê bao tắt máy dài ngày hoặc hủy tạm thời (MS PURGED).</w:t>
       </w:r>
     </w:p>
     <w:p>
@@ -2237,64 +2196,6 @@
     </w:p>
     <w:p>
       <w:pPr>
-        <w:spacing w:before="120" w:after="40" w:line="240" w:lineRule="auto"/>
-        <w:ind w:firstLine="0"/>
-        <w:jc w:val="center"/>
-      </w:pPr>
-      <w:r>
-        <w:drawing>
-          <wp:inline xmlns:a="http://schemas.openxmlformats.org/drawingml/2006/main" xmlns:pic="http://schemas.openxmlformats.org/drawingml/2006/picture">
-            <wp:extent cx="5486400" cy="2603182"/>
-            <wp:docPr id="3" name="Picture 3"/>
-            <wp:cNvGraphicFramePr>
-              <a:graphicFrameLocks noChangeAspect="1"/>
-            </wp:cNvGraphicFramePr>
-            <a:graphic>
-              <a:graphicData uri="http://schemas.openxmlformats.org/drawingml/2006/picture">
-                <pic:pic>
-                  <pic:nvPicPr>
-                    <pic:cNvPr id="0" name="screenshot_ai_summary_table.png"/>
-                    <pic:cNvPicPr/>
-                  </pic:nvPicPr>
-                  <pic:blipFill>
-                    <a:blip r:embed="rId12"/>
-                    <a:stretch>
-                      <a:fillRect/>
-                    </a:stretch>
-                  </pic:blipFill>
-                  <pic:spPr>
-                    <a:xfrm>
-                      <a:off x="0" y="0"/>
-                      <a:ext cx="5486400" cy="2603182"/>
-                    </a:xfrm>
-                    <a:prstGeom prst="rect"/>
-                  </pic:spPr>
-                </pic:pic>
-              </a:graphicData>
-            </a:graphic>
-          </wp:inline>
-        </w:drawing>
-      </w:r>
-    </w:p>
-    <w:p>
-      <w:pPr>
-        <w:spacing w:before="40" w:after="160" w:line="264" w:lineRule="auto"/>
-        <w:ind w:firstLine="0"/>
-        <w:jc w:val="center"/>
-      </w:pPr>
-      <w:r>
-        <w:rPr>
-          <w:rFonts w:ascii="Times New Roman" w:hAnsi="Times New Roman"/>
-          <w:b w:val="0"/>
-          <w:i/>
-          <w:sz w:val="22"/>
-          <w:rFonts w:ascii="Times New Roman" w:hAnsi="Times New Roman" w:cs="Times New Roman" w:eastAsia="Times New Roman"/>
-        </w:rPr>
-        <w:t>Hình 3: Kết quả tiền kiểm tra hạ tầng Core và phân tích tóm tắt phản ánh Mobile Internet bằng AI 6 trường cốt lõi</w:t>
-      </w:r>
-    </w:p>
-    <w:p>
-      <w:pPr>
         <w:spacing w:before="0" w:after="60" w:line="288" w:lineRule="auto"/>
         <w:ind w:firstLine="562"/>
         <w:jc w:val="both"/>
@@ -2341,7 +2242,7 @@
           <w:sz w:val="26"/>
           <w:rFonts w:ascii="Times New Roman" w:hAnsi="Times New Roman" w:cs="Times New Roman" w:eastAsia="Times New Roman"/>
         </w:rPr>
-        <w:t>d) Chế độ đóng thủ công an toàn 1-Click cho các phiếu đặc thù:</w:t>
+        <w:t>d) Chuẩn hóa phân cấp nút tác nghiệp và chế độ đóng an toàn 1-Click:</w:t>
       </w:r>
     </w:p>
     <w:p>
@@ -2358,65 +2259,7 @@
           <w:sz w:val="26"/>
           <w:rFonts w:ascii="Times New Roman" w:hAnsi="Times New Roman" w:cs="Times New Roman" w:eastAsia="Times New Roman"/>
         </w:rPr>
-        <w:t>Đối với các phiếu Data phức tạp cần rà soát lại (nghi ngờ suy hao sóng trạm BTS, cần đo kiểm địa bàn), KTV chỉ cần bấm nút “Đóng thủ công”. Hệ thống tự động mở form “Cập nhật xử lý” trên TTS và tự động điền sẵn toàn bộ trường quy chuẩn: B0 = True, Cột 10 (Nguyên nhân kỹ thuật), Cột 11 (Nội dung xử lý và kiến nghị Kỹ thuật địa bàn). KTV chỉ mất 1 giây lướt qua và bấm Lưu.</w:t>
-      </w:r>
-    </w:p>
-    <w:p>
-      <w:pPr>
-        <w:spacing w:before="120" w:after="40" w:line="240" w:lineRule="auto"/>
-        <w:ind w:firstLine="0"/>
-        <w:jc w:val="center"/>
-      </w:pPr>
-      <w:r>
-        <w:drawing>
-          <wp:inline xmlns:a="http://schemas.openxmlformats.org/drawingml/2006/main" xmlns:pic="http://schemas.openxmlformats.org/drawingml/2006/picture">
-            <wp:extent cx="5486400" cy="2676925"/>
-            <wp:docPr id="4" name="Picture 4"/>
-            <wp:cNvGraphicFramePr>
-              <a:graphicFrameLocks noChangeAspect="1"/>
-            </wp:cNvGraphicFramePr>
-            <a:graphic>
-              <a:graphicData uri="http://schemas.openxmlformats.org/drawingml/2006/picture">
-                <pic:pic>
-                  <pic:nvPicPr>
-                    <pic:cNvPr id="0" name="screenshot_closed_nam.png"/>
-                    <pic:cNvPicPr/>
-                  </pic:nvPicPr>
-                  <pic:blipFill>
-                    <a:blip r:embed="rId13"/>
-                    <a:stretch>
-                      <a:fillRect/>
-                    </a:stretch>
-                  </pic:blipFill>
-                  <pic:spPr>
-                    <a:xfrm>
-                      <a:off x="0" y="0"/>
-                      <a:ext cx="5486400" cy="2676925"/>
-                    </a:xfrm>
-                    <a:prstGeom prst="rect"/>
-                  </pic:spPr>
-                </pic:pic>
-              </a:graphicData>
-            </a:graphic>
-          </wp:inline>
-        </w:drawing>
-      </w:r>
-    </w:p>
-    <w:p>
-      <w:pPr>
-        <w:spacing w:before="40" w:after="160" w:line="264" w:lineRule="auto"/>
-        <w:ind w:firstLine="0"/>
-        <w:jc w:val="center"/>
-      </w:pPr>
-      <w:r>
-        <w:rPr>
-          <w:rFonts w:ascii="Times New Roman" w:hAnsi="Times New Roman"/>
-          <w:b w:val="0"/>
-          <w:i/>
-          <w:sz w:val="22"/>
-          <w:rFonts w:ascii="Times New Roman" w:hAnsi="Times New Roman" w:cs="Times New Roman" w:eastAsia="Times New Roman"/>
-        </w:rPr>
-        <w:t>Hình 4: Minh chứng phiếu phản ánh khách hàng Mobile Internet đã được hệ thống tiền kiểm tra, phân loại kịch bản và đóng thành công</w:t>
+        <w:t>Hệ thống thiết kế phân cấp màu sắc khoa học giữa các thao tác điều chuyển bước nghiệp vụ và đóng dứt điểm: nút 'Chuyển 2.4' (màu tím Indigo) chuyển phối hợp SOC, nút 'Chuyển 2.6' (màu xanh Cyan viễn thông) chuyển bước chốt mạng lưới, và nút 'Đóng phiếu' / 'Đóng 2.6' (màu xanh lá cây) hoàn tất đóng phiếu dứt điểm, kết hợp nút 'Đóng 5.1' (màu xanh thẫm) chuyển địa bàn. Khi KTV kích hoạt, hệ thống tự động điền đầy đủ các trường quy chuẩn (nguyên nhân kỹ thuật theo danh mục chuẩn OneOSS, nội dung xử lý giải trình, mã kết luận đóng phiếu) và gửi trực tiếp qua API tới TTS và liên thông CCOS/PMS/FMS chỉ trong 1-2 giây, bảo đảm KTV không phải nhập liệu biểu mẫu phức tạp bằng tay và loại trừ hoàn toàn nguy cơ thao tác nhầm lẫn.</w:t>
       </w:r>
     </w:p>
     <w:p>
@@ -2502,64 +2345,6 @@
           <w:rFonts w:ascii="Times New Roman" w:hAnsi="Times New Roman" w:cs="Times New Roman" w:eastAsia="Times New Roman"/>
         </w:rPr>
         <w:t>• Hỗ trợ ra quyết định và đóng phiếu nhanh: KTV không phải đăng nhập rời rạc để tra cứu hồ sơ. Dữ liệu tiền kiểm tra hiển thị trực quan giúp KTV nhận định chính xác nguyên nhân và thực hiện đóng phiếu hoặc chuyển điều phối kỹ thuật chỉ với 1 click chuột trực tiếp ngay trên Dashboard.</w:t>
-      </w:r>
-    </w:p>
-    <w:p>
-      <w:pPr>
-        <w:spacing w:before="120" w:after="40" w:line="240" w:lineRule="auto"/>
-        <w:ind w:firstLine="0"/>
-        <w:jc w:val="center"/>
-      </w:pPr>
-      <w:r>
-        <w:drawing>
-          <wp:inline xmlns:a="http://schemas.openxmlformats.org/drawingml/2006/main" xmlns:pic="http://schemas.openxmlformats.org/drawingml/2006/picture">
-            <wp:extent cx="5486400" cy="2603182"/>
-            <wp:docPr id="5" name="Picture 5"/>
-            <wp:cNvGraphicFramePr>
-              <a:graphicFrameLocks noChangeAspect="1"/>
-            </wp:cNvGraphicFramePr>
-            <a:graphic>
-              <a:graphicData uri="http://schemas.openxmlformats.org/drawingml/2006/picture">
-                <pic:pic>
-                  <pic:nvPicPr>
-                    <pic:cNvPr id="0" name="screenshot_ttsnew_voicesms.png"/>
-                    <pic:cNvPicPr/>
-                  </pic:nvPicPr>
-                  <pic:blipFill>
-                    <a:blip r:embed="rId14"/>
-                    <a:stretch>
-                      <a:fillRect/>
-                    </a:stretch>
-                  </pic:blipFill>
-                  <pic:spPr>
-                    <a:xfrm>
-                      <a:off x="0" y="0"/>
-                      <a:ext cx="5486400" cy="2603182"/>
-                    </a:xfrm>
-                    <a:prstGeom prst="rect"/>
-                  </pic:spPr>
-                </pic:pic>
-              </a:graphicData>
-            </a:graphic>
-          </wp:inline>
-        </w:drawing>
-      </w:r>
-    </w:p>
-    <w:p>
-      <w:pPr>
-        <w:spacing w:before="40" w:after="160" w:line="264" w:lineRule="auto"/>
-        <w:ind w:firstLine="0"/>
-        <w:jc w:val="center"/>
-      </w:pPr>
-      <w:r>
-        <w:rPr>
-          <w:rFonts w:ascii="Times New Roman" w:hAnsi="Times New Roman"/>
-          <w:b w:val="0"/>
-          <w:i/>
-          <w:sz w:val="22"/>
-          <w:rFonts w:ascii="Times New Roman" w:hAnsi="Times New Roman" w:cs="Times New Roman" w:eastAsia="Times New Roman"/>
-        </w:rPr>
-        <w:t>Hình 5: Phân hệ quản lý và hỗ trợ tiền kiểm tra danh mục phiếu sự cố Thoại / Tin nhắn SMS / Gói / PA Khác tập trung trên Dashboard</w:t>
       </w:r>
     </w:p>
     <w:p>
@@ -2678,7 +2463,7 @@
           <w:sz w:val="26"/>
           <w:rFonts w:ascii="Times New Roman" w:hAnsi="Times New Roman" w:cs="Times New Roman" w:eastAsia="Times New Roman"/>
         </w:rPr>
-        <w:t>5. Giải pháp an toàn thông tin và cô lập tài khoản trong mạng LAN (LAN Token Isolation):</w:t>
+        <w:t>5. Tiện ích đồng bộ phiên tự động và giải pháp an toàn thông tin cô lập tài khoản mạng LAN (LAN Token Isolation):</w:t>
       </w:r>
     </w:p>
     <w:p>
@@ -2712,7 +2497,7 @@
           <w:sz w:val="26"/>
           <w:rFonts w:ascii="Times New Roman" w:hAnsi="Times New Roman" w:cs="Times New Roman" w:eastAsia="Times New Roman"/>
         </w:rPr>
-        <w:t>• Tuyệt đối không lưu trữ mật khẩu: Phiên làm việc (Bearer Token / Cookie) được trích xuất an toàn từ chính trình duyệt Chrome đang đăng nhập của nhân viên thông qua Chrome DevTools Protocol (CDP), không lưu trữ mật khẩu dạng rõ;</w:t>
+        <w:t>• Tiện ích mở rộng Chrome Extension chuyên dụng (VNPT TTS Precheck Helper): Tự động trích xuất và đồng bộ an toàn 1-click Cookie/Token từ các cổng tác nghiệp (BTools, CEM, SAPC, TTS Cũ/Mới) về máy chủ Dashboard, giải quyết triệt để rào cản đăng nhập và xác thực đa yếu tố (OTP/CAS) mà không cần can thiệp hay lưu trữ mật khẩu người dùng;</w:t>
       </w:r>
     </w:p>
     <w:p>
@@ -2729,7 +2514,24 @@
           <w:sz w:val="26"/>
           <w:rFonts w:ascii="Times New Roman" w:hAnsi="Times New Roman" w:cs="Times New Roman" w:eastAsia="Times New Roman"/>
         </w:rPr>
-        <w:t>• Cơ chế cô lập Token mạng LAN (auth_tts.py): Khi triển khai dùng chung trong mạng nội bộ, mỗi máy trạm khi gửi lệnh đóng phiếu bắt buộc phải cung cấp token xác thực của chính tài khoản người đó. Máy chủ tuyệt đối không dùng token của mình để đóng thay cho máy khách. Cơ chế này đảm bảo tính minh bạch, đúng thẩm quyền cá nhân và tuân thủ chặt chẽ quy chế an toàn thông tin của Tập đoàn.</w:t>
+        <w:t>• Tuyệt đối không lưu trữ mật khẩu: Phiên làm việc (Bearer Token / Cookie) được đồng bộ an toàn từ chính trình duyệt đang đăng nhập của nhân viên thông qua giao thức an toàn nội bộ, không lưu trữ mật khẩu dạng rõ bên ngoài;</w:t>
+      </w:r>
+    </w:p>
+    <w:p>
+      <w:pPr>
+        <w:spacing w:before="0" w:after="60" w:line="288" w:lineRule="auto"/>
+        <w:ind w:left="504" w:hanging="288"/>
+        <w:jc w:val="both"/>
+      </w:pPr>
+      <w:r>
+        <w:rPr>
+          <w:rFonts w:ascii="Times New Roman" w:hAnsi="Times New Roman"/>
+          <w:b w:val="0"/>
+          <w:i w:val="0"/>
+          <w:sz w:val="26"/>
+          <w:rFonts w:ascii="Times New Roman" w:hAnsi="Times New Roman" w:cs="Times New Roman" w:eastAsia="Times New Roman"/>
+        </w:rPr>
+        <w:t>• Cơ chế cô lập Token mạng LAN (auth_extractor.py): Khi triển khai dùng chung trong mạng nội bộ, mỗi máy trạm khi gửi lệnh đóng phiếu bắt buộc phải cung cấp token xác thực của chính tài khoản người đó. Máy chủ tuyệt đối không dùng token của mình để đóng thay cho máy khách. Cơ chế này đảm bảo tính minh bạch, đúng thẩm quyền cá nhân và tuân thủ chặt chẽ quy chế an toàn thông tin của Tập đoàn.</w:t>
       </w:r>
     </w:p>
     <w:p>
@@ -2893,7 +2695,7 @@
               </w:rPr>
               <w:t>Mô tả đối tượng sau khi áp dụng sáng kiến</w:t>
               <w:br/>
-              <w:t>(Hệ thống tự động hóa VNPT PRECHECK)</w:t>
+              <w:t>(Hệ thống tự động hóa VNPT TTS PRECHECK)</w:t>
             </w:r>
           </w:p>
         </w:tc>
@@ -4590,11 +4392,11 @@
               </w:rPr>
               <w:t>- Tự động hóa toàn trình dịch vụ Mobile Internet (chiếm &gt;80% lưu lượng và 75%-80% phiếu phản ánh), tự động đóng phiếu trực tiếp 85% - 90% qua REST API.</w:t>
               <w:br/>
-              <w:t>- Xây dựng nền tảng tiền kiểm tra tập trung cho các loại phiếu khác (Thoại, SMS, Gói cước) và hỗ trợ xử lý 1-click trên Dashboard.</w:t>
+              <w:t>- Nền tảng tiền kiểm tra tập trung đa dịch vụ (Data, Thoại, SMS, Gói cước) với 25 kịch bản chẩn đoán chuyên sâu, cảnh báo trực quan trạm lỗi và ứng dụng VPN.</w:t>
               <w:br/>
-              <w:t>- Tích hợp 25 kịch bản chẩn đoán kỹ thuật, phát hiện app VPN và cảnh báo đỏ ngay sau Cell.</w:t>
+              <w:t>- Giao diện Dashboard công thái học (Ergonomic UI) hỗ trợ Chế độ Ngày/Đêm (Dark/Light Mode) chống mỏi mắt cho ca trực kỹ thuật 24/7; phân cấp màu sắc nút tác nghiệp chuẩn xác (Chuyển 2.4 / Chuyển 2.6 / Đóng 2.6 / Đóng 5.1) loại trừ hoàn toàn nguy cơ nhầm lẫn.</w:t>
               <w:br/>
-              <w:t>- Kết nối trực tiếp REST API cả TTS Cũ và Mới, cơ chế cô lập Token LAN tuyệt đối an toàn.</w:t>
+              <w:t>- Tiện ích Chrome Extension đồng bộ Token/Cookie 1-click an toàn, cơ chế cô lập Token trong mạng LAN bảo đảm tuyệt đối ATTT.</w:t>
             </w:r>
           </w:p>
         </w:tc>
@@ -5697,7 +5499,7 @@
           <w:sz w:val="26"/>
           <w:rFonts w:ascii="Times New Roman" w:hAnsi="Times New Roman" w:cs="Times New Roman" w:eastAsia="Times New Roman"/>
         </w:rPr>
-        <w:t>1. Toàn bộ mã nguồn hoàn chỉnh của phần mềm VNPT PRECHECK và tài liệu đặc tả kiến trúc kỹ thuật của hệ thống;</w:t>
+        <w:t>1. Toàn bộ mã nguồn hoàn chỉnh của phần mềm VNPT TTS PRECHECK và tài liệu đặc tả kiến trúc kỹ thuật của hệ thống;</w:t>
       </w:r>
     </w:p>
     <w:p>
@@ -5882,7 +5684,7 @@
         <w:sz w:val="19"/>
         <w:rFonts w:ascii="Times New Roman" w:hAnsi="Times New Roman" w:cs="Times New Roman" w:eastAsia="Times New Roman"/>
       </w:rPr>
-      <w:t>VNPT PRECHECK • Copyright by quangvu@vnpt.vn (Sep.2026)</w:t>
+      <w:t>VNPT TTS PRECHECK • Copyright by quangvu@vnpt.vn (Sep.2026)</w:t>
     </w:r>
   </w:p>
 </w:ftr>

</xml_diff>